<commit_message>
Assignment 1.1: Started the Site Map for the Design Report
</commit_message>
<xml_diff>
--- a/assignments/A1.1 - Design Report - Naveen Sellathurai.docx
+++ b/assignments/A1.1 - Design Report - Naveen Sellathurai.docx
@@ -23,7 +23,7 @@
       <w:r>
         <w:t xml:space="preserve">, declare that this assignment, titled [Assignment Title], is my own original work and has not been copied from any other source except where explicitly acknowledged. I have not engaged in plagiarism, collusion, or any other form of academic misconduct in the preparation and submission of this assignment. All sources of information and data used in this assignment have been properly cited and referenced in accordance with the prescribed guidelines. I have not used unauthorized assistance in the preparation of this assignment and have not allowed any other student to copy my work. I am aware that any breach of academic integrity may result in disciplinary action as per the </w:t>
       </w:r>
-      <w:hyperlink r:id="rId6">
+      <w:hyperlink r:id="rId7">
         <w:r>
           <w:rPr>
             <w:color w:val="1155CC"/>
@@ -1051,6 +1051,18 @@
     </w:p>
     <w:p>
       <w:pPr>
+        <w:spacing w:after="200"/>
+      </w:pPr>
+      <w:r>
+        <w:t xml:space="preserve">Option: </w:t>
+      </w:r>
+      <w:r>
+        <w:t>Environmental education &amp; climate literacy</w:t>
+      </w:r>
+    </w:p>
+    <w:p/>
+    <w:p>
+      <w:pPr>
         <w:pStyle w:val="Heading2"/>
       </w:pPr>
       <w:bookmarkStart w:id="4" w:name="_mcglbz6h86yz" w:colFirst="0" w:colLast="0"/>
@@ -1061,12 +1073,889 @@
     </w:p>
     <w:p>
       <w:pPr>
+        <w:rPr>
+          <w:lang w:val="en-AU"/>
+        </w:rPr>
+      </w:pPr>
+      <w:r>
+        <w:rPr>
+          <w:lang w:val="en-AU"/>
+        </w:rPr>
+        <w:t xml:space="preserve">BUSINESS REQUIREMENT (CATEGORY A): </w:t>
+      </w:r>
+    </w:p>
+    <w:p>
+      <w:pPr>
+        <w:rPr>
+          <w:lang w:val="en-AU"/>
+        </w:rPr>
+      </w:pPr>
+      <w:r>
+        <w:rPr>
+          <w:b/>
+          <w:bCs/>
+          <w:lang w:val="en-AU"/>
+        </w:rPr>
+        <w:t>BR (A.1): Development Stack [Coverage: Week 1]</w:t>
+      </w:r>
+    </w:p>
+    <w:p>
+      <w:pPr>
+        <w:rPr>
+          <w:lang w:val="en-AU"/>
+        </w:rPr>
+      </w:pPr>
+      <w:r>
+        <w:rPr>
+          <w:lang w:val="en-AU"/>
+        </w:rPr>
+        <w:t xml:space="preserve">The new Web Application must be developed using </w:t>
+      </w:r>
+      <w:proofErr w:type="spellStart"/>
+      <w:r>
+        <w:rPr>
+          <w:lang w:val="en-AU"/>
+        </w:rPr>
+        <w:t>VueJS</w:t>
+      </w:r>
+      <w:proofErr w:type="spellEnd"/>
+      <w:r>
+        <w:rPr>
+          <w:lang w:val="en-AU"/>
+        </w:rPr>
+        <w:t xml:space="preserve"> 3 framework with Composition API.</w:t>
+      </w:r>
+    </w:p>
+    <w:p>
+      <w:pPr>
+        <w:rPr>
+          <w:lang w:val="en-AU"/>
+        </w:rPr>
+      </w:pPr>
+      <w:r>
+        <w:rPr>
+          <w:b/>
+          <w:bCs/>
+          <w:lang w:val="en-AU"/>
+        </w:rPr>
+        <w:t>BR (A.2): Responsiveness</w:t>
+      </w:r>
+      <w:r>
+        <w:rPr>
+          <w:lang w:val="en-AU"/>
+        </w:rPr>
+        <w:t xml:space="preserve"> </w:t>
+      </w:r>
+    </w:p>
+    <w:p>
+      <w:pPr>
+        <w:rPr>
+          <w:lang w:val="en-AU"/>
+        </w:rPr>
+      </w:pPr>
+      <w:r>
+        <w:rPr>
+          <w:lang w:val="en-AU"/>
+        </w:rPr>
+        <w:t>The new Web Application must have responsiveness capability to be compatible with various devices.</w:t>
+      </w:r>
+    </w:p>
+    <w:p/>
+    <w:p>
+      <w:pPr>
+        <w:rPr>
+          <w:lang w:val="en-AU"/>
+        </w:rPr>
+      </w:pPr>
+      <w:r>
+        <w:rPr>
+          <w:lang w:val="en-AU"/>
+        </w:rPr>
+        <w:t xml:space="preserve">BUSINESS REQUIREMENT (CATEGORY B): </w:t>
+      </w:r>
+    </w:p>
+    <w:p>
+      <w:pPr>
+        <w:rPr>
+          <w:lang w:val="en-AU"/>
+        </w:rPr>
+      </w:pPr>
+      <w:r>
+        <w:rPr>
+          <w:b/>
+          <w:bCs/>
+          <w:lang w:val="en-AU"/>
+        </w:rPr>
+        <w:t>BR (B.1): Validations</w:t>
+      </w:r>
+    </w:p>
+    <w:p>
+      <w:pPr>
+        <w:rPr>
+          <w:lang w:val="en-AU"/>
+        </w:rPr>
+      </w:pPr>
+      <w:r>
+        <w:rPr>
+          <w:lang w:val="en-AU"/>
+        </w:rPr>
+        <w:t xml:space="preserve">The new Web Application must implement user input validations with a minimum of two different types of validations. </w:t>
+      </w:r>
+    </w:p>
+    <w:p>
+      <w:pPr>
+        <w:rPr>
+          <w:lang w:val="en-AU"/>
+        </w:rPr>
+      </w:pPr>
+      <w:r>
+        <w:rPr>
+          <w:b/>
+          <w:bCs/>
+          <w:lang w:val="en-AU"/>
+        </w:rPr>
+        <w:t>BR (B.2): Dynamic Data</w:t>
+      </w:r>
+      <w:r>
+        <w:rPr>
+          <w:lang w:val="en-AU"/>
+        </w:rPr>
+        <w:t xml:space="preserve"> </w:t>
+      </w:r>
+    </w:p>
+    <w:p>
+      <w:pPr>
+        <w:rPr>
+          <w:lang w:val="en-AU"/>
+        </w:rPr>
+      </w:pPr>
+      <w:r>
+        <w:rPr>
+          <w:lang w:val="en-AU"/>
+        </w:rPr>
+        <w:t xml:space="preserve">The new Web Application must be able to dynamically fetch and displays values from the underlying JavaScript data structures (e.g. fetched from JSON, State variables or </w:t>
+      </w:r>
+      <w:proofErr w:type="spellStart"/>
+      <w:r>
+        <w:rPr>
+          <w:lang w:val="en-AU"/>
+        </w:rPr>
+        <w:t>vue</w:t>
+      </w:r>
+      <w:proofErr w:type="spellEnd"/>
+      <w:r>
+        <w:rPr>
+          <w:lang w:val="en-AU"/>
+        </w:rPr>
+        <w:t xml:space="preserve"> binding). </w:t>
+      </w:r>
+    </w:p>
+    <w:p/>
+    <w:p>
+      <w:pPr>
+        <w:rPr>
+          <w:lang w:val="en-AU"/>
+        </w:rPr>
+      </w:pPr>
+      <w:r>
+        <w:rPr>
+          <w:lang w:val="en-AU"/>
+        </w:rPr>
+        <w:t>BUSINESS REQUIREMENT (CATEGORY C):</w:t>
+      </w:r>
+    </w:p>
+    <w:p>
+      <w:pPr>
+        <w:rPr>
+          <w:color w:val="EE0000"/>
+          <w:lang w:val="en-AU"/>
+        </w:rPr>
+      </w:pPr>
+      <w:r>
+        <w:rPr>
+          <w:b/>
+          <w:bCs/>
+          <w:color w:val="EE0000"/>
+          <w:lang w:val="en-AU"/>
+        </w:rPr>
+        <w:t>BR (C.1): Authentication</w:t>
+      </w:r>
+      <w:r>
+        <w:rPr>
+          <w:color w:val="EE0000"/>
+          <w:lang w:val="en-AU"/>
+        </w:rPr>
+        <w:t xml:space="preserve"> </w:t>
+      </w:r>
+    </w:p>
+    <w:p>
+      <w:pPr>
+        <w:rPr>
+          <w:color w:val="EE0000"/>
+          <w:lang w:val="en-AU"/>
+        </w:rPr>
+      </w:pPr>
+      <w:r>
+        <w:rPr>
+          <w:color w:val="EE0000"/>
+          <w:lang w:val="en-AU"/>
+        </w:rPr>
+        <w:t xml:space="preserve">The new Web Application must have a </w:t>
+      </w:r>
+      <w:r>
+        <w:rPr>
+          <w:color w:val="EE0000"/>
+          <w:u w:val="single"/>
+          <w:lang w:val="en-AU"/>
+        </w:rPr>
+        <w:t>basic</w:t>
+      </w:r>
+      <w:r>
+        <w:rPr>
+          <w:color w:val="EE0000"/>
+          <w:lang w:val="en-AU"/>
+        </w:rPr>
+        <w:t xml:space="preserve"> authentication mechanism (login/register functionality and user accounts) to provide confidentiality.</w:t>
+      </w:r>
+    </w:p>
+    <w:p>
+      <w:pPr>
+        <w:rPr>
+          <w:lang w:val="en-AU"/>
+        </w:rPr>
+      </w:pPr>
+      <w:r>
+        <w:rPr>
+          <w:b/>
+          <w:bCs/>
+          <w:lang w:val="en-AU"/>
+        </w:rPr>
+        <w:t>BR (C.2): Role-based authentication</w:t>
+      </w:r>
+    </w:p>
+    <w:p>
+      <w:pPr>
+        <w:rPr>
+          <w:lang w:val="en-AU"/>
+        </w:rPr>
+      </w:pPr>
+      <w:r>
+        <w:rPr>
+          <w:lang w:val="en-AU"/>
+        </w:rPr>
+        <w:t>The new Web Application must have a role-based authentication mechanism (supporting different types of users) with a minimum of two roles to support different authorisation levels on pages.</w:t>
+      </w:r>
+    </w:p>
+    <w:p>
+      <w:pPr>
+        <w:rPr>
+          <w:lang w:val="en-AU"/>
+        </w:rPr>
+      </w:pPr>
+      <w:r>
+        <w:rPr>
+          <w:b/>
+          <w:bCs/>
+          <w:lang w:val="en-AU"/>
+        </w:rPr>
+        <w:t>BR (C.3): Rating</w:t>
+      </w:r>
+    </w:p>
+    <w:p>
+      <w:pPr>
+        <w:rPr>
+          <w:lang w:val="en-AU"/>
+        </w:rPr>
+      </w:pPr>
+      <w:r>
+        <w:rPr>
+          <w:lang w:val="en-AU"/>
+        </w:rPr>
+        <w:t>The new Web Application must implement an aggregated rating score feature. Users can rate and see the average rating from all users for a particular aspect (Such as Reviews).</w:t>
+      </w:r>
+    </w:p>
+    <w:p>
+      <w:pPr>
+        <w:rPr>
+          <w:lang w:val="en-AU"/>
+        </w:rPr>
+      </w:pPr>
+      <w:r>
+        <w:rPr>
+          <w:b/>
+          <w:bCs/>
+          <w:lang w:val="en-AU"/>
+        </w:rPr>
+        <w:t>BR (C.4): Security</w:t>
+      </w:r>
+    </w:p>
+    <w:p>
+      <w:pPr>
+        <w:rPr>
+          <w:lang w:val="en-AU"/>
+        </w:rPr>
+      </w:pPr>
+      <w:r>
+        <w:rPr>
+          <w:lang w:val="en-AU"/>
+        </w:rPr>
+        <w:t>The new Web Application must implement basic security to protect from online attacks such as XSS. Also needs to follow basic security practices (e.g. implementing client-side data validation).</w:t>
+      </w:r>
+    </w:p>
+    <w:p/>
+    <w:p>
+      <w:pPr>
+        <w:rPr>
+          <w:lang w:val="en-AU"/>
+        </w:rPr>
+      </w:pPr>
+      <w:r>
+        <w:rPr>
+          <w:lang w:val="en-AU"/>
+        </w:rPr>
+        <w:t>BUSINESS REQUIREMENT (CATEGORY D)</w:t>
+      </w:r>
+    </w:p>
+    <w:p>
+      <w:pPr>
+        <w:rPr>
+          <w:lang w:val="en-AU"/>
+        </w:rPr>
+      </w:pPr>
+      <w:r>
+        <w:rPr>
+          <w:b/>
+          <w:bCs/>
+          <w:lang w:val="en-AU"/>
+        </w:rPr>
+        <w:t>BR (D.1): External Authentication</w:t>
+      </w:r>
+    </w:p>
+    <w:p>
+      <w:pPr>
+        <w:rPr>
+          <w:lang w:val="en-AU"/>
+        </w:rPr>
+      </w:pPr>
+      <w:r>
+        <w:rPr>
+          <w:lang w:val="en-AU"/>
+        </w:rPr>
+        <w:t>The new Web Application must have an external authentication mechanism (such as Firebase Auth).</w:t>
+      </w:r>
+    </w:p>
+    <w:p>
+      <w:pPr>
+        <w:rPr>
+          <w:lang w:val="en-AU"/>
+        </w:rPr>
+      </w:pPr>
+      <w:r>
+        <w:rPr>
+          <w:b/>
+          <w:bCs/>
+          <w:lang w:val="en-AU"/>
+        </w:rPr>
+        <w:t>BR (D.2): Email</w:t>
+      </w:r>
+    </w:p>
+    <w:p>
+      <w:pPr>
+        <w:rPr>
+          <w:lang w:val="en-AU"/>
+        </w:rPr>
+      </w:pPr>
+      <w:r>
+        <w:rPr>
+          <w:lang w:val="en-AU"/>
+        </w:rPr>
+        <w:t>The new Web Application must be able to send emails with an attachment. Use SendGrid API or other email API services to achieve this.</w:t>
+      </w:r>
+    </w:p>
+    <w:p>
+      <w:pPr>
+        <w:rPr>
+          <w:color w:val="EE0000"/>
+          <w:lang w:val="en-AU"/>
+        </w:rPr>
+      </w:pPr>
+      <w:r>
+        <w:rPr>
+          <w:b/>
+          <w:bCs/>
+          <w:color w:val="EE0000"/>
+          <w:lang w:val="en-AU"/>
+        </w:rPr>
+        <w:t>BR (D.3): Interactive Table Data</w:t>
+      </w:r>
+    </w:p>
+    <w:p>
+      <w:pPr>
+        <w:rPr>
+          <w:color w:val="EE0000"/>
+          <w:lang w:val="en-AU"/>
+        </w:rPr>
+      </w:pPr>
+      <w:r>
+        <w:rPr>
+          <w:color w:val="EE0000"/>
+          <w:lang w:val="en-AU"/>
+        </w:rPr>
+        <w:t xml:space="preserve">The new Web Application must display interactive table data with a minimum of two tables. The table needs to </w:t>
+      </w:r>
+      <w:proofErr w:type="gramStart"/>
+      <w:r>
+        <w:rPr>
+          <w:color w:val="EE0000"/>
+          <w:lang w:val="en-AU"/>
+        </w:rPr>
+        <w:t>support:</w:t>
+      </w:r>
+      <w:proofErr w:type="gramEnd"/>
+      <w:r>
+        <w:rPr>
+          <w:color w:val="EE0000"/>
+          <w:lang w:val="en-AU"/>
+        </w:rPr>
+        <w:t xml:space="preserve"> sort, search and limit to 10 rows per page. User must be able to search by individual column.</w:t>
+      </w:r>
+    </w:p>
+    <w:p>
+      <w:pPr>
+        <w:rPr>
+          <w:lang w:val="en-AU"/>
+        </w:rPr>
+      </w:pPr>
+      <w:r>
+        <w:rPr>
+          <w:b/>
+          <w:bCs/>
+          <w:lang w:val="en-AU"/>
+        </w:rPr>
+        <w:t>BR (D.4): Deployment to the cloud</w:t>
+      </w:r>
+    </w:p>
+    <w:p>
+      <w:pPr>
+        <w:rPr>
+          <w:lang w:val="en-AU"/>
+        </w:rPr>
+      </w:pPr>
+      <w:r>
+        <w:rPr>
+          <w:lang w:val="en-AU"/>
+        </w:rPr>
+        <w:t xml:space="preserve">Fully working public online version hosted (e.g. on Cloudflare Pages, on Google Cloud Hosting etc). </w:t>
+      </w:r>
+    </w:p>
+    <w:p>
+      <w:pPr>
+        <w:rPr>
+          <w:lang w:val="en-AU"/>
+        </w:rPr>
+      </w:pPr>
+    </w:p>
+    <w:p>
+      <w:pPr>
+        <w:rPr>
+          <w:lang w:val="en-AU"/>
+        </w:rPr>
+      </w:pPr>
+      <w:r>
+        <w:rPr>
+          <w:lang w:val="en-AU"/>
+        </w:rPr>
+        <w:t>BUSINESS REQUIREMENT (CATEGORY E)</w:t>
+      </w:r>
+    </w:p>
+    <w:p>
+      <w:pPr>
+        <w:rPr>
+          <w:lang w:val="en-AU"/>
+        </w:rPr>
+      </w:pPr>
+      <w:r>
+        <w:rPr>
+          <w:b/>
+          <w:bCs/>
+          <w:lang w:val="en-AU"/>
+        </w:rPr>
+        <w:t>BR (E.1): Cloud Functions</w:t>
+      </w:r>
+    </w:p>
+    <w:p>
+      <w:pPr>
+        <w:rPr>
+          <w:lang w:val="en-AU"/>
+        </w:rPr>
+      </w:pPr>
+      <w:r>
+        <w:rPr>
+          <w:lang w:val="en-AU"/>
+        </w:rPr>
+        <w:t xml:space="preserve">The new Web Application must use serverless such as Firebase Cloud functions to execute server-side functionality. </w:t>
+      </w:r>
+    </w:p>
+    <w:p>
+      <w:pPr>
+        <w:rPr>
+          <w:lang w:val="en-AU"/>
+        </w:rPr>
+      </w:pPr>
+      <w:r>
+        <w:rPr>
+          <w:b/>
+          <w:bCs/>
+          <w:lang w:val="en-AU"/>
+        </w:rPr>
+        <w:t>BR (E.2): Geo Location</w:t>
+      </w:r>
+    </w:p>
+    <w:p>
+      <w:pPr>
+        <w:rPr>
+          <w:lang w:val="en-AU"/>
+        </w:rPr>
+      </w:pPr>
+      <w:r>
+        <w:rPr>
+          <w:lang w:val="en-AU"/>
+        </w:rPr>
+        <w:t xml:space="preserve">The new Web Application must display a map with minimum two features. These two features need to be non-trivial features. For example: searching places of interest, navigate between places, and trip information etc. </w:t>
+      </w:r>
+    </w:p>
+    <w:p>
+      <w:pPr>
+        <w:rPr>
+          <w:lang w:val="en-AU"/>
+        </w:rPr>
+      </w:pPr>
+      <w:r>
+        <w:rPr>
+          <w:b/>
+          <w:bCs/>
+          <w:lang w:val="en-AU"/>
+        </w:rPr>
+        <w:t>B</w:t>
+      </w:r>
+      <w:r>
+        <w:rPr>
+          <w:b/>
+          <w:bCs/>
+          <w:lang w:val="en-AU"/>
+        </w:rPr>
+        <w:t>R (E.3): Accessibility</w:t>
+      </w:r>
+    </w:p>
+    <w:p>
+      <w:pPr>
+        <w:rPr>
+          <w:lang w:val="en-AU"/>
+        </w:rPr>
+      </w:pPr>
+      <w:r>
+        <w:rPr>
+          <w:lang w:val="en-AU"/>
+        </w:rPr>
+        <w:t>The application must meet WCAG 2.1 accessibility standards at the AA level to ensure usability by people with a range of disabilities. Provide accessibility features such as keyboard navigability in forms and provide text alternatives for non-text content.</w:t>
+      </w:r>
+    </w:p>
+    <w:p>
+      <w:pPr>
+        <w:rPr>
+          <w:color w:val="EE0000"/>
+          <w:lang w:val="en-AU"/>
+        </w:rPr>
+      </w:pPr>
+      <w:r>
+        <w:rPr>
+          <w:b/>
+          <w:bCs/>
+          <w:color w:val="EE0000"/>
+          <w:lang w:val="en-AU"/>
+        </w:rPr>
+        <w:t>BR (E.4): Export</w:t>
+      </w:r>
+      <w:r>
+        <w:rPr>
+          <w:color w:val="EE0000"/>
+          <w:lang w:val="en-AU"/>
+        </w:rPr>
+        <w:t xml:space="preserve"> </w:t>
+      </w:r>
+    </w:p>
+    <w:p>
+      <w:pPr>
+        <w:rPr>
+          <w:color w:val="EE0000"/>
+          <w:lang w:val="en-AU"/>
+        </w:rPr>
+      </w:pPr>
+      <w:r>
+        <w:rPr>
+          <w:color w:val="EE0000"/>
+          <w:lang w:val="en-AU"/>
+        </w:rPr>
+        <w:t>The new Web Application must be able to export data (for example: as CSV or PDF file).</w:t>
+      </w:r>
+    </w:p>
+    <w:p/>
+    <w:p>
+      <w:pPr>
+        <w:rPr>
+          <w:lang w:val="en-AU"/>
+        </w:rPr>
+      </w:pPr>
+      <w:r>
+        <w:rPr>
+          <w:lang w:val="en-AU"/>
+        </w:rPr>
+        <w:t>BUSINESS REQUIREMENT (CATEGORY F):</w:t>
+      </w:r>
+    </w:p>
+    <w:p>
+      <w:pPr>
+        <w:rPr>
+          <w:lang w:val="en-AU"/>
+        </w:rPr>
+      </w:pPr>
+      <w:r>
+        <w:rPr>
+          <w:b/>
+          <w:bCs/>
+          <w:lang w:val="en-AU"/>
+        </w:rPr>
+        <w:t>BR (F.1): Innovation</w:t>
+      </w:r>
+    </w:p>
+    <w:p>
+      <w:pPr>
+        <w:rPr>
+          <w:lang w:val="en-AU"/>
+        </w:rPr>
+      </w:pPr>
+      <w:r>
+        <w:rPr>
+          <w:lang w:val="en-AU"/>
+        </w:rPr>
+        <w:t xml:space="preserve">The new Web Application must implement </w:t>
+      </w:r>
+      <w:r>
+        <w:rPr>
+          <w:b/>
+          <w:bCs/>
+          <w:lang w:val="en-AU"/>
+        </w:rPr>
+        <w:t>four</w:t>
+      </w:r>
+      <w:r>
+        <w:rPr>
+          <w:lang w:val="en-AU"/>
+        </w:rPr>
+        <w:t xml:space="preserve"> extended innovative features aimed at improving User Experience (UX). A research report with details on which features have been implemented and recommendations for future upgrades </w:t>
+      </w:r>
+      <w:r>
+        <w:rPr>
+          <w:b/>
+          <w:bCs/>
+          <w:lang w:val="en-AU"/>
+        </w:rPr>
+        <w:t>must be prepared</w:t>
+      </w:r>
+      <w:r>
+        <w:rPr>
+          <w:lang w:val="en-AU"/>
+        </w:rPr>
+        <w:t xml:space="preserve"> and submitted. Note that implemented innovations may represent enhancements to existing features. Examples of extended innovative features: </w:t>
+      </w:r>
+    </w:p>
+    <w:p>
+      <w:pPr>
+        <w:numPr>
+          <w:ilvl w:val="0"/>
+          <w:numId w:val="1"/>
+        </w:numPr>
+        <w:rPr>
+          <w:lang w:val="en-AU"/>
+        </w:rPr>
+      </w:pPr>
+      <w:r>
+        <w:rPr>
+          <w:lang w:val="en-AU"/>
+        </w:rPr>
+        <w:t xml:space="preserve">Appointment Booking (using Calendar): The new Web Application must implement booking constraints such as booking conflict management using Calendar. </w:t>
+      </w:r>
+      <w:r>
+        <w:rPr>
+          <w:b/>
+          <w:bCs/>
+          <w:lang w:val="en-AU"/>
+        </w:rPr>
+        <w:t>Hint:</w:t>
+      </w:r>
+      <w:r>
+        <w:rPr>
+          <w:lang w:val="en-AU"/>
+        </w:rPr>
+        <w:t xml:space="preserve"> Displaying features on a Calendar such as event constraint can be done using </w:t>
+      </w:r>
+      <w:hyperlink r:id="rId8" w:tgtFrame="_blank" w:history="1">
+        <w:r>
+          <w:rPr>
+            <w:rStyle w:val="Hyperlink"/>
+            <w:lang w:val="en-AU"/>
+          </w:rPr>
+          <w:t>FullCalendar.io</w:t>
+        </w:r>
+      </w:hyperlink>
+      <w:r>
+        <w:rPr>
+          <w:lang w:val="en-AU"/>
+        </w:rPr>
+        <w:t xml:space="preserve"> API</w:t>
+      </w:r>
+    </w:p>
+    <w:p>
+      <w:pPr>
+        <w:numPr>
+          <w:ilvl w:val="0"/>
+          <w:numId w:val="1"/>
+        </w:numPr>
+        <w:rPr>
+          <w:lang w:val="en-AU"/>
+        </w:rPr>
+      </w:pPr>
+      <w:r>
+        <w:rPr>
+          <w:lang w:val="en-AU"/>
+        </w:rPr>
+        <w:t>Bulk Email: The new Web Application must be able to send bulk email to selected users.</w:t>
+      </w:r>
+    </w:p>
+    <w:p>
+      <w:pPr>
+        <w:numPr>
+          <w:ilvl w:val="0"/>
+          <w:numId w:val="1"/>
+        </w:numPr>
+        <w:rPr>
+          <w:lang w:val="en-AU"/>
+        </w:rPr>
+      </w:pPr>
+      <w:r>
+        <w:rPr>
+          <w:lang w:val="en-AU"/>
+        </w:rPr>
+        <w:t>Provide API access to others i.e. exposing at least 2 routes on your platform to allow third parties to fetch data using REST protocol.</w:t>
+      </w:r>
+    </w:p>
+    <w:p>
+      <w:pPr>
+        <w:numPr>
+          <w:ilvl w:val="0"/>
+          <w:numId w:val="1"/>
+        </w:numPr>
+        <w:rPr>
+          <w:lang w:val="en-AU"/>
+        </w:rPr>
+      </w:pPr>
+      <w:r>
+        <w:rPr>
+          <w:lang w:val="en-AU"/>
+        </w:rPr>
+        <w:t xml:space="preserve">Interactive Charts - The new Web Application must display an interactive chart or graph using data from </w:t>
+      </w:r>
+      <w:proofErr w:type="spellStart"/>
+      <w:r>
+        <w:rPr>
+          <w:lang w:val="en-AU"/>
+        </w:rPr>
+        <w:t>Firestore</w:t>
+      </w:r>
+      <w:proofErr w:type="spellEnd"/>
+      <w:r>
+        <w:rPr>
+          <w:lang w:val="en-AU"/>
+        </w:rPr>
+        <w:t xml:space="preserve">. </w:t>
+      </w:r>
+    </w:p>
+    <w:p>
+      <w:pPr>
+        <w:numPr>
+          <w:ilvl w:val="0"/>
+          <w:numId w:val="1"/>
+        </w:numPr>
+        <w:rPr>
+          <w:lang w:val="en-AU"/>
+        </w:rPr>
+      </w:pPr>
+      <w:r>
+        <w:rPr>
+          <w:lang w:val="en-AU"/>
+        </w:rPr>
+        <w:t>Incorporate GenAI such as Gemini API or OpenAI API (note: Gemini API can be used for testing free of cost, so it is recommended to use that or similar free of cost APIs for testing)</w:t>
+      </w:r>
+    </w:p>
+    <w:p>
+      <w:pPr>
+        <w:numPr>
+          <w:ilvl w:val="0"/>
+          <w:numId w:val="1"/>
+        </w:numPr>
+        <w:rPr>
+          <w:lang w:val="en-AU"/>
+        </w:rPr>
+      </w:pPr>
+      <w:r>
+        <w:rPr>
+          <w:lang w:val="en-AU"/>
+        </w:rPr>
+        <w:t xml:space="preserve">Admin Dashboard - Create a dashboard view for the system admin of this environmental charity (you may want to create a </w:t>
+      </w:r>
+      <w:proofErr w:type="spellStart"/>
+      <w:r>
+        <w:rPr>
+          <w:lang w:val="en-AU"/>
+        </w:rPr>
+        <w:t>seprate</w:t>
+      </w:r>
+      <w:proofErr w:type="spellEnd"/>
+      <w:r>
+        <w:rPr>
+          <w:lang w:val="en-AU"/>
+        </w:rPr>
+        <w:t xml:space="preserve"> role for ‘admin’), where they can see an overview of the website including number of users and types of users.</w:t>
+      </w:r>
+    </w:p>
+    <w:p>
+      <w:pPr>
+        <w:numPr>
+          <w:ilvl w:val="0"/>
+          <w:numId w:val="1"/>
+        </w:numPr>
+        <w:rPr>
+          <w:lang w:val="en-AU"/>
+        </w:rPr>
+      </w:pPr>
+      <w:r>
+        <w:rPr>
+          <w:lang w:val="en-AU"/>
+        </w:rPr>
+        <w:t>App with at least two offline features like: Checking if user is online/offline, extended use of Local Storage etc.</w:t>
+      </w:r>
+    </w:p>
+    <w:p/>
+    <w:p/>
+    <w:p>
+      <w:pPr>
         <w:pStyle w:val="Heading2"/>
       </w:pPr>
       <w:r>
         <w:t>Section 3: User Personas</w:t>
       </w:r>
     </w:p>
+    <w:p/>
     <w:p>
       <w:pPr>
         <w:pStyle w:val="Heading2"/>
@@ -1077,20 +1966,33 @@
         <w:t>Section 4: Wireframes/Low-fidelity prototype</w:t>
       </w:r>
     </w:p>
-    <w:p>
-      <w:pPr>
-        <w:pStyle w:val="Heading2"/>
-      </w:pPr>
+    <w:p/>
+    <w:p>
       <w:bookmarkStart w:id="6" w:name="_t3r3kp80rvj6" w:colFirst="0" w:colLast="0"/>
       <w:bookmarkEnd w:id="6"/>
     </w:p>
     <w:p>
       <w:pPr>
-        <w:pStyle w:val="Heading2"/>
+        <w:rPr>
+          <w:b/>
+          <w:bCs/>
+          <w:sz w:val="32"/>
+          <w:szCs w:val="32"/>
+        </w:rPr>
       </w:pPr>
       <w:bookmarkStart w:id="7" w:name="_tfrl2vc49yie" w:colFirst="0" w:colLast="0"/>
       <w:bookmarkEnd w:id="7"/>
       <w:r>
+        <w:lastRenderedPageBreak/>
+        <w:br w:type="page"/>
+      </w:r>
+    </w:p>
+    <w:p>
+      <w:pPr>
+        <w:pStyle w:val="Heading2"/>
+      </w:pPr>
+      <w:r>
+        <w:lastRenderedPageBreak/>
         <w:t>Declaration: Additional Help</w:t>
       </w:r>
     </w:p>
@@ -1126,7 +2028,7 @@
       <w:r>
         <w:t xml:space="preserve">However, you may use GenAI for brainstorming, problem solving and learning. You need to declare all such uses here. One row per help used. More details on how to acknowledge the use of Gen AI can be found </w:t>
       </w:r>
-      <w:hyperlink r:id="rId7">
+      <w:hyperlink r:id="rId9">
         <w:r>
           <w:rPr>
             <w:color w:val="0000FF"/>
@@ -1353,7 +2255,7 @@
     <w:p/>
     <w:p/>
     <w:sectPr>
-      <w:headerReference w:type="default" r:id="rId8"/>
+      <w:headerReference w:type="default" r:id="rId10"/>
       <w:pgSz w:w="11909" w:h="16834"/>
       <w:pgMar w:top="1440" w:right="1440" w:bottom="1440" w:left="1440" w:header="720" w:footer="720" w:gutter="0"/>
       <w:pgNumType w:start="1"/>
@@ -1542,6 +2444,163 @@
     </w:r>
   </w:p>
 </w:hdr>
+</file>
+
+<file path=word/numbering.xml><?xml version="1.0" encoding="utf-8"?>
+<w:numbering xmlns:wpc="http://schemas.microsoft.com/office/word/2010/wordprocessingCanvas" xmlns:cx="http://schemas.microsoft.com/office/drawing/2014/chartex" xmlns:cx1="http://schemas.microsoft.com/office/drawing/2015/9/8/chartex" xmlns:cx2="http://schemas.microsoft.com/office/drawing/2015/10/21/chartex" xmlns:cx3="http://schemas.microsoft.com/office/drawing/2016/5/9/chartex" xmlns:cx4="http://schemas.microsoft.com/office/drawing/2016/5/10/chartex" xmlns:cx5="http://schemas.microsoft.com/office/drawing/2016/5/11/chartex" xmlns:cx6="http://schemas.microsoft.com/office/drawing/2016/5/12/chartex" xmlns:cx7="http://schemas.microsoft.com/office/drawing/2016/5/13/chartex" xmlns:cx8="http://schemas.microsoft.com/office/drawing/2016/5/14/chartex" xmlns:mc="http://schemas.openxmlformats.org/markup-compatibility/2006" xmlns:aink="http://schemas.microsoft.com/office/drawing/2016/ink" xmlns:am3d="http://schemas.microsoft.com/office/drawing/2017/model3d" xmlns:o="urn:schemas-microsoft-com:office:office" xmlns:oel="http://schemas.microsoft.com/office/2019/extlst" xmlns:r="http://schemas.openxmlformats.org/officeDocument/2006/relationships" xmlns:m="http://schemas.openxmlformats.org/officeDocument/2006/math" xmlns:v="urn:schemas-microsoft-com:vml" xmlns:wp14="http://schemas.microsoft.com/office/word/2010/wordprocessingDrawing" xmlns:wp="http://schemas.openxmlformats.org/drawingml/2006/wordprocessingDrawing" xmlns:w10="urn:schemas-microsoft-com:office:word" xmlns:w="http://schemas.openxmlformats.org/wordprocessingml/2006/main" xmlns:w14="http://schemas.microsoft.com/office/word/2010/wordml" xmlns:w15="http://schemas.microsoft.com/office/word/2012/wordml" xmlns:w16cei="http://schemas.microsoft.com/office/word/2026/wordml/cei" xmlns:w16cex="http://schemas.microsoft.com/office/word/2018/wordml/cex" xmlns:w16cid="http://schemas.microsoft.com/office/word/2016/wordml/cid" xmlns:w16="http://schemas.microsoft.com/office/word/2018/wordml" xmlns:w16du="http://schemas.microsoft.com/office/word/2023/wordml/word16du" xmlns:w16sdtdh="http://schemas.microsoft.com/office/word/2020/wordml/sdtdatahash" xmlns:w16sdtfl="http://schemas.microsoft.com/office/word/2024/wordml/sdtformatlock" xmlns:w16se="http://schemas.microsoft.com/office/word/2015/wordml/symex" xmlns:wpg="http://schemas.microsoft.com/office/word/2010/wordprocessingGroup" xmlns:wpi="http://schemas.microsoft.com/office/word/2010/wordprocessingInk" xmlns:wne="http://schemas.microsoft.com/office/word/2006/wordml" xmlns:wps="http://schemas.microsoft.com/office/word/2010/wordprocessingShape" mc:Ignorable="w14 w15 w16se w16cid w16 w16cex w16sdtdh w16sdtfl w16du wp14">
+  <w:abstractNum w:abstractNumId="0" w15:restartNumberingAfterBreak="0">
+    <w:nsid w:val="168510E2"/>
+    <w:multiLevelType w:val="multilevel"/>
+    <w:tmpl w:val="D7E4FA56"/>
+    <w:lvl w:ilvl="0">
+      <w:start w:val="1"/>
+      <w:numFmt w:val="bullet"/>
+      <w:lvlText w:val=""/>
+      <w:lvlJc w:val="left"/>
+      <w:pPr>
+        <w:tabs>
+          <w:tab w:val="num" w:pos="720"/>
+        </w:tabs>
+        <w:ind w:left="720" w:hanging="360"/>
+      </w:pPr>
+      <w:rPr>
+        <w:rFonts w:ascii="Symbol" w:hAnsi="Symbol" w:hint="default"/>
+        <w:sz w:val="20"/>
+      </w:rPr>
+    </w:lvl>
+    <w:lvl w:ilvl="1" w:tentative="1">
+      <w:start w:val="1"/>
+      <w:numFmt w:val="bullet"/>
+      <w:lvlText w:val="o"/>
+      <w:lvlJc w:val="left"/>
+      <w:pPr>
+        <w:tabs>
+          <w:tab w:val="num" w:pos="1440"/>
+        </w:tabs>
+        <w:ind w:left="1440" w:hanging="360"/>
+      </w:pPr>
+      <w:rPr>
+        <w:rFonts w:ascii="Courier New" w:hAnsi="Courier New" w:hint="default"/>
+        <w:sz w:val="20"/>
+      </w:rPr>
+    </w:lvl>
+    <w:lvl w:ilvl="2" w:tentative="1">
+      <w:start w:val="1"/>
+      <w:numFmt w:val="bullet"/>
+      <w:lvlText w:val=""/>
+      <w:lvlJc w:val="left"/>
+      <w:pPr>
+        <w:tabs>
+          <w:tab w:val="num" w:pos="2160"/>
+        </w:tabs>
+        <w:ind w:left="2160" w:hanging="360"/>
+      </w:pPr>
+      <w:rPr>
+        <w:rFonts w:ascii="Wingdings" w:hAnsi="Wingdings" w:hint="default"/>
+        <w:sz w:val="20"/>
+      </w:rPr>
+    </w:lvl>
+    <w:lvl w:ilvl="3" w:tentative="1">
+      <w:start w:val="1"/>
+      <w:numFmt w:val="bullet"/>
+      <w:lvlText w:val=""/>
+      <w:lvlJc w:val="left"/>
+      <w:pPr>
+        <w:tabs>
+          <w:tab w:val="num" w:pos="2880"/>
+        </w:tabs>
+        <w:ind w:left="2880" w:hanging="360"/>
+      </w:pPr>
+      <w:rPr>
+        <w:rFonts w:ascii="Wingdings" w:hAnsi="Wingdings" w:hint="default"/>
+        <w:sz w:val="20"/>
+      </w:rPr>
+    </w:lvl>
+    <w:lvl w:ilvl="4" w:tentative="1">
+      <w:start w:val="1"/>
+      <w:numFmt w:val="bullet"/>
+      <w:lvlText w:val=""/>
+      <w:lvlJc w:val="left"/>
+      <w:pPr>
+        <w:tabs>
+          <w:tab w:val="num" w:pos="3600"/>
+        </w:tabs>
+        <w:ind w:left="3600" w:hanging="360"/>
+      </w:pPr>
+      <w:rPr>
+        <w:rFonts w:ascii="Wingdings" w:hAnsi="Wingdings" w:hint="default"/>
+        <w:sz w:val="20"/>
+      </w:rPr>
+    </w:lvl>
+    <w:lvl w:ilvl="5" w:tentative="1">
+      <w:start w:val="1"/>
+      <w:numFmt w:val="bullet"/>
+      <w:lvlText w:val=""/>
+      <w:lvlJc w:val="left"/>
+      <w:pPr>
+        <w:tabs>
+          <w:tab w:val="num" w:pos="4320"/>
+        </w:tabs>
+        <w:ind w:left="4320" w:hanging="360"/>
+      </w:pPr>
+      <w:rPr>
+        <w:rFonts w:ascii="Wingdings" w:hAnsi="Wingdings" w:hint="default"/>
+        <w:sz w:val="20"/>
+      </w:rPr>
+    </w:lvl>
+    <w:lvl w:ilvl="6" w:tentative="1">
+      <w:start w:val="1"/>
+      <w:numFmt w:val="bullet"/>
+      <w:lvlText w:val=""/>
+      <w:lvlJc w:val="left"/>
+      <w:pPr>
+        <w:tabs>
+          <w:tab w:val="num" w:pos="5040"/>
+        </w:tabs>
+        <w:ind w:left="5040" w:hanging="360"/>
+      </w:pPr>
+      <w:rPr>
+        <w:rFonts w:ascii="Wingdings" w:hAnsi="Wingdings" w:hint="default"/>
+        <w:sz w:val="20"/>
+      </w:rPr>
+    </w:lvl>
+    <w:lvl w:ilvl="7" w:tentative="1">
+      <w:start w:val="1"/>
+      <w:numFmt w:val="bullet"/>
+      <w:lvlText w:val=""/>
+      <w:lvlJc w:val="left"/>
+      <w:pPr>
+        <w:tabs>
+          <w:tab w:val="num" w:pos="5760"/>
+        </w:tabs>
+        <w:ind w:left="5760" w:hanging="360"/>
+      </w:pPr>
+      <w:rPr>
+        <w:rFonts w:ascii="Wingdings" w:hAnsi="Wingdings" w:hint="default"/>
+        <w:sz w:val="20"/>
+      </w:rPr>
+    </w:lvl>
+    <w:lvl w:ilvl="8" w:tentative="1">
+      <w:start w:val="1"/>
+      <w:numFmt w:val="bullet"/>
+      <w:lvlText w:val=""/>
+      <w:lvlJc w:val="left"/>
+      <w:pPr>
+        <w:tabs>
+          <w:tab w:val="num" w:pos="6480"/>
+        </w:tabs>
+        <w:ind w:left="6480" w:hanging="360"/>
+      </w:pPr>
+      <w:rPr>
+        <w:rFonts w:ascii="Wingdings" w:hAnsi="Wingdings" w:hint="default"/>
+        <w:sz w:val="20"/>
+      </w:rPr>
+    </w:lvl>
+  </w:abstractNum>
+  <w:num w:numId="1" w16cid:durableId="842821451">
+    <w:abstractNumId w:val="0"/>
+  </w:num>
+</w:numbering>
 </file>
 
 <file path=word/styles.xml><?xml version="1.0" encoding="utf-8"?>
@@ -2062,7 +3121,6 @@
   <w:style w:type="character" w:default="1" w:styleId="DefaultParagraphFont">
     <w:name w:val="Default Paragraph Font"/>
     <w:uiPriority w:val="1"/>
-    <w:semiHidden/>
     <w:unhideWhenUsed/>
   </w:style>
   <w:style w:type="table" w:default="1" w:styleId="TableNormal">
@@ -2195,6 +3253,29 @@
     <w:link w:val="Footer"/>
     <w:uiPriority w:val="99"/>
     <w:rsid w:val="00613F7F"/>
+  </w:style>
+  <w:style w:type="character" w:styleId="Hyperlink">
+    <w:name w:val="Hyperlink"/>
+    <w:basedOn w:val="DefaultParagraphFont"/>
+    <w:uiPriority w:val="99"/>
+    <w:unhideWhenUsed/>
+    <w:rsid w:val="009B7C0F"/>
+    <w:rPr>
+      <w:color w:val="0000FF" w:themeColor="hyperlink"/>
+      <w:u w:val="single"/>
+    </w:rPr>
+  </w:style>
+  <w:style w:type="character" w:styleId="UnresolvedMention">
+    <w:name w:val="Unresolved Mention"/>
+    <w:basedOn w:val="DefaultParagraphFont"/>
+    <w:uiPriority w:val="99"/>
+    <w:semiHidden/>
+    <w:unhideWhenUsed/>
+    <w:rsid w:val="009B7C0F"/>
+    <w:rPr>
+      <w:color w:val="605E5C"/>
+      <w:shd w:val="clear" w:color="auto" w:fill="E1DFDD"/>
+    </w:rPr>
   </w:style>
 </w:styles>
 </file>

</xml_diff>

<commit_message>
Assignment 1.1: Updated the Site Map - Also added in Business Requirements For Easy Referencing (Will be removed once Design Report is Completed)
</commit_message>
<xml_diff>
--- a/assignments/A1.1 - Design Report - Naveen Sellathurai.docx
+++ b/assignments/A1.1 - Design Report - Naveen Sellathurai.docx
@@ -1776,11 +1776,13 @@
           <w:numId w:val="1"/>
         </w:numPr>
         <w:rPr>
-          <w:lang w:val="en-AU"/>
-        </w:rPr>
-      </w:pPr>
-      <w:r>
-        <w:rPr>
+          <w:color w:val="EE0000"/>
+          <w:lang w:val="en-AU"/>
+        </w:rPr>
+      </w:pPr>
+      <w:r>
+        <w:rPr>
+          <w:color w:val="EE0000"/>
           <w:lang w:val="en-AU"/>
         </w:rPr>
         <w:t xml:space="preserve">Appointment Booking (using Calendar): The new Web Application must implement booking constraints such as booking conflict management using Calendar. </w:t>
@@ -1789,12 +1791,14 @@
         <w:rPr>
           <w:b/>
           <w:bCs/>
+          <w:color w:val="EE0000"/>
           <w:lang w:val="en-AU"/>
         </w:rPr>
         <w:t>Hint:</w:t>
       </w:r>
       <w:r>
         <w:rPr>
+          <w:color w:val="EE0000"/>
           <w:lang w:val="en-AU"/>
         </w:rPr>
         <w:t xml:space="preserve"> Displaying features on a Calendar such as event constraint can be done using </w:t>
@@ -1803,6 +1807,7 @@
         <w:r>
           <w:rPr>
             <w:rStyle w:val="Hyperlink"/>
+            <w:color w:val="EE0000"/>
             <w:lang w:val="en-AU"/>
           </w:rPr>
           <w:t>FullCalendar.io</w:t>
@@ -1810,6 +1815,7 @@
       </w:hyperlink>
       <w:r>
         <w:rPr>
+          <w:color w:val="EE0000"/>
           <w:lang w:val="en-AU"/>
         </w:rPr>
         <w:t xml:space="preserve"> API</w:t>
@@ -1822,11 +1828,13 @@
           <w:numId w:val="1"/>
         </w:numPr>
         <w:rPr>
-          <w:lang w:val="en-AU"/>
-        </w:rPr>
-      </w:pPr>
-      <w:r>
-        <w:rPr>
+          <w:color w:val="EE0000"/>
+          <w:lang w:val="en-AU"/>
+        </w:rPr>
+      </w:pPr>
+      <w:r>
+        <w:rPr>
+          <w:color w:val="EE0000"/>
           <w:lang w:val="en-AU"/>
         </w:rPr>
         <w:t>Bulk Email: The new Web Application must be able to send bulk email to selected users.</w:t>
@@ -1856,11 +1864,13 @@
           <w:numId w:val="1"/>
         </w:numPr>
         <w:rPr>
-          <w:lang w:val="en-AU"/>
-        </w:rPr>
-      </w:pPr>
-      <w:r>
-        <w:rPr>
+          <w:color w:val="EE0000"/>
+          <w:lang w:val="en-AU"/>
+        </w:rPr>
+      </w:pPr>
+      <w:r>
+        <w:rPr>
+          <w:color w:val="EE0000"/>
           <w:lang w:val="en-AU"/>
         </w:rPr>
         <w:t xml:space="preserve">Interactive Charts - The new Web Application must display an interactive chart or graph using data from </w:t>
@@ -1868,6 +1878,7 @@
       <w:proofErr w:type="spellStart"/>
       <w:r>
         <w:rPr>
+          <w:color w:val="EE0000"/>
           <w:lang w:val="en-AU"/>
         </w:rPr>
         <w:t>Firestore</w:t>
@@ -1875,6 +1886,7 @@
       <w:proofErr w:type="spellEnd"/>
       <w:r>
         <w:rPr>
+          <w:color w:val="EE0000"/>
           <w:lang w:val="en-AU"/>
         </w:rPr>
         <w:t xml:space="preserve">. </w:t>
@@ -1904,11 +1916,13 @@
           <w:numId w:val="1"/>
         </w:numPr>
         <w:rPr>
-          <w:lang w:val="en-AU"/>
-        </w:rPr>
-      </w:pPr>
-      <w:r>
-        <w:rPr>
+          <w:color w:val="EE0000"/>
+          <w:lang w:val="en-AU"/>
+        </w:rPr>
+      </w:pPr>
+      <w:r>
+        <w:rPr>
+          <w:color w:val="EE0000"/>
           <w:lang w:val="en-AU"/>
         </w:rPr>
         <w:t xml:space="preserve">Admin Dashboard - Create a dashboard view for the system admin of this environmental charity (you may want to create a </w:t>
@@ -1916,6 +1930,7 @@
       <w:proofErr w:type="spellStart"/>
       <w:r>
         <w:rPr>
+          <w:color w:val="EE0000"/>
           <w:lang w:val="en-AU"/>
         </w:rPr>
         <w:t>seprate</w:t>
@@ -1923,6 +1938,7 @@
       <w:proofErr w:type="spellEnd"/>
       <w:r>
         <w:rPr>
+          <w:color w:val="EE0000"/>
           <w:lang w:val="en-AU"/>
         </w:rPr>
         <w:t xml:space="preserve"> role for ‘admin’), where they can see an overview of the website including number of users and types of users.</w:t>

</xml_diff>

<commit_message>
Assignment 1.1: Added Sitemap to the Report
</commit_message>
<xml_diff>
--- a/assignments/A1.1 - Design Report - Naveen Sellathurai.docx
+++ b/assignments/A1.1 - Design Report - Naveen Sellathurai.docx
@@ -57,26 +57,13 @@
       </w:pPr>
       <w:bookmarkStart w:id="1" w:name="_55vw5n8q2yr7" w:colFirst="0" w:colLast="0"/>
       <w:bookmarkEnd w:id="1"/>
-      <w:proofErr w:type="spellStart"/>
-      <w:r>
-        <w:t>Github</w:t>
-      </w:r>
-      <w:proofErr w:type="spellEnd"/>
-      <w:r>
-        <w:t xml:space="preserve"> Check</w:t>
-      </w:r>
-    </w:p>
-    <w:p>
-      <w:r>
-        <w:t xml:space="preserve">Enter your </w:t>
-      </w:r>
-      <w:proofErr w:type="spellStart"/>
-      <w:r>
-        <w:t>Github</w:t>
-      </w:r>
-      <w:proofErr w:type="spellEnd"/>
-      <w:r>
-        <w:t xml:space="preserve"> details here.</w:t>
+      <w:r>
+        <w:t>Github Check</w:t>
+      </w:r>
+    </w:p>
+    <w:p>
+      <w:r>
+        <w:t>Enter your Github details here.</w:t>
       </w:r>
     </w:p>
     <w:tbl>
@@ -123,13 +110,8 @@
               <w:spacing w:line="240" w:lineRule="auto"/>
               <w:jc w:val="left"/>
             </w:pPr>
-            <w:proofErr w:type="spellStart"/>
             <w:r>
-              <w:t>Github</w:t>
-            </w:r>
-            <w:proofErr w:type="spellEnd"/>
-            <w:r>
-              <w:t xml:space="preserve"> Username</w:t>
+              <w:t>Github Username</w:t>
             </w:r>
           </w:p>
           <w:p>
@@ -292,21 +274,7 @@
         <w:rPr>
           <w:rFonts w:ascii="Arial Unicode MS" w:eastAsia="Arial Unicode MS" w:hAnsi="Arial Unicode MS" w:cs="Arial Unicode MS"/>
         </w:rPr>
-        <w:t xml:space="preserve">Rate your performance for each </w:t>
-      </w:r>
-      <w:proofErr w:type="gramStart"/>
-      <w:r>
-        <w:rPr>
-          <w:rFonts w:ascii="Arial Unicode MS" w:eastAsia="Arial Unicode MS" w:hAnsi="Arial Unicode MS" w:cs="Arial Unicode MS"/>
-        </w:rPr>
-        <w:t>criteria</w:t>
-      </w:r>
-      <w:proofErr w:type="gramEnd"/>
-      <w:r>
-        <w:rPr>
-          <w:rFonts w:ascii="Arial Unicode MS" w:eastAsia="Arial Unicode MS" w:hAnsi="Arial Unicode MS" w:cs="Arial Unicode MS"/>
-        </w:rPr>
-        <w:t>. Put a ✅(tick) in the box where you think your work belongs.</w:t>
+        <w:t>Rate your performance for each criteria. Put a ✅(tick) in the box where you think your work belongs.</w:t>
       </w:r>
     </w:p>
     <w:p/>
@@ -1064,10 +1032,21 @@
     <w:p>
       <w:pPr>
         <w:pStyle w:val="Heading2"/>
-      </w:pPr>
-      <w:bookmarkStart w:id="4" w:name="_mcglbz6h86yz" w:colFirst="0" w:colLast="0"/>
-      <w:bookmarkEnd w:id="4"/>
-      <w:r>
+        <w:sectPr>
+          <w:headerReference w:type="default" r:id="rId8"/>
+          <w:pgSz w:w="11909" w:h="16834"/>
+          <w:pgMar w:top="1440" w:right="1440" w:bottom="1440" w:left="1440" w:header="720" w:footer="720" w:gutter="0"/>
+          <w:pgNumType w:start="1"/>
+          <w:cols w:space="720"/>
+        </w:sectPr>
+      </w:pPr>
+    </w:p>
+    <w:p>
+      <w:pPr>
+        <w:pStyle w:val="Heading2"/>
+      </w:pPr>
+      <w:r>
+        <w:lastRenderedPageBreak/>
         <w:t>Section 2: Sitemap</w:t>
       </w:r>
     </w:p>
@@ -1077,10 +1056,86 @@
           <w:lang w:val="en-AU"/>
         </w:rPr>
       </w:pPr>
-      <w:r>
-        <w:rPr>
-          <w:lang w:val="en-AU"/>
-        </w:rPr>
+    </w:p>
+    <w:p>
+      <w:pPr>
+        <w:rPr>
+          <w:lang w:val="en-AU"/>
+        </w:rPr>
+        <w:sectPr>
+          <w:pgSz w:w="16834" w:h="11909" w:orient="landscape"/>
+          <w:pgMar w:top="1440" w:right="1440" w:bottom="1440" w:left="1440" w:header="720" w:footer="720" w:gutter="0"/>
+          <w:pgNumType w:start="1"/>
+          <w:cols w:space="720"/>
+          <w:docGrid w:linePitch="299"/>
+        </w:sectPr>
+      </w:pPr>
+      <w:r>
+        <w:rPr>
+          <w:noProof/>
+          <w:lang w:val="en-AU"/>
+        </w:rPr>
+        <w:drawing>
+          <wp:inline distT="0" distB="0" distL="0" distR="0" wp14:anchorId="40C600A8" wp14:editId="608FDE68">
+            <wp:extent cx="8862060" cy="4008120"/>
+            <wp:effectExtent l="0" t="0" r="0" b="0"/>
+            <wp:docPr id="825773657" name="Picture 2"/>
+            <wp:cNvGraphicFramePr>
+              <a:graphicFrameLocks xmlns:a="http://schemas.openxmlformats.org/drawingml/2006/main" noChangeAspect="1"/>
+            </wp:cNvGraphicFramePr>
+            <a:graphic xmlns:a="http://schemas.openxmlformats.org/drawingml/2006/main">
+              <a:graphicData uri="http://schemas.openxmlformats.org/drawingml/2006/picture">
+                <pic:pic xmlns:pic="http://schemas.openxmlformats.org/drawingml/2006/picture">
+                  <pic:nvPicPr>
+                    <pic:cNvPr id="0" name="Picture 2"/>
+                    <pic:cNvPicPr>
+                      <a:picLocks noChangeAspect="1" noChangeArrowheads="1"/>
+                    </pic:cNvPicPr>
+                  </pic:nvPicPr>
+                  <pic:blipFill>
+                    <a:blip r:embed="rId9">
+                      <a:extLst>
+                        <a:ext uri="{28A0092B-C50C-407E-A947-70E740481C1C}">
+                          <a14:useLocalDpi xmlns:a14="http://schemas.microsoft.com/office/drawing/2010/main" val="0"/>
+                        </a:ext>
+                      </a:extLst>
+                    </a:blip>
+                    <a:srcRect/>
+                    <a:stretch>
+                      <a:fillRect/>
+                    </a:stretch>
+                  </pic:blipFill>
+                  <pic:spPr bwMode="auto">
+                    <a:xfrm>
+                      <a:off x="0" y="0"/>
+                      <a:ext cx="8862060" cy="4008120"/>
+                    </a:xfrm>
+                    <a:prstGeom prst="rect">
+                      <a:avLst/>
+                    </a:prstGeom>
+                    <a:noFill/>
+                    <a:ln>
+                      <a:noFill/>
+                    </a:ln>
+                  </pic:spPr>
+                </pic:pic>
+              </a:graphicData>
+            </a:graphic>
+          </wp:inline>
+        </w:drawing>
+      </w:r>
+    </w:p>
+    <w:p>
+      <w:pPr>
+        <w:rPr>
+          <w:lang w:val="en-AU"/>
+        </w:rPr>
+      </w:pPr>
+      <w:r>
+        <w:rPr>
+          <w:lang w:val="en-AU"/>
+        </w:rPr>
+        <w:lastRenderedPageBreak/>
         <w:t xml:space="preserve">BUSINESS REQUIREMENT (CATEGORY A): </w:t>
       </w:r>
     </w:p>
@@ -1109,21 +1164,7 @@
         <w:rPr>
           <w:lang w:val="en-AU"/>
         </w:rPr>
-        <w:t xml:space="preserve">The new Web Application must be developed using </w:t>
-      </w:r>
-      <w:proofErr w:type="spellStart"/>
-      <w:r>
-        <w:rPr>
-          <w:lang w:val="en-AU"/>
-        </w:rPr>
-        <w:t>VueJS</w:t>
-      </w:r>
-      <w:proofErr w:type="spellEnd"/>
-      <w:r>
-        <w:rPr>
-          <w:lang w:val="en-AU"/>
-        </w:rPr>
-        <w:t xml:space="preserve"> 3 framework with Composition API.</w:t>
+        <w:t>The new Web Application must be developed using VueJS 3 framework with Composition API.</w:t>
       </w:r>
     </w:p>
     <w:p>
@@ -1233,21 +1274,7 @@
         <w:rPr>
           <w:lang w:val="en-AU"/>
         </w:rPr>
-        <w:t xml:space="preserve">The new Web Application must be able to dynamically fetch and displays values from the underlying JavaScript data structures (e.g. fetched from JSON, State variables or </w:t>
-      </w:r>
-      <w:proofErr w:type="spellStart"/>
-      <w:r>
-        <w:rPr>
-          <w:lang w:val="en-AU"/>
-        </w:rPr>
-        <w:t>vue</w:t>
-      </w:r>
-      <w:proofErr w:type="spellEnd"/>
-      <w:r>
-        <w:rPr>
-          <w:lang w:val="en-AU"/>
-        </w:rPr>
-        <w:t xml:space="preserve"> binding). </w:t>
+        <w:t xml:space="preserve">The new Web Application must be able to dynamically fetch and displays values from the underlying JavaScript data structures (e.g. fetched from JSON, State variables or vue binding). </w:t>
       </w:r>
     </w:p>
     <w:p/>
@@ -1501,23 +1528,7 @@
           <w:color w:val="EE0000"/>
           <w:lang w:val="en-AU"/>
         </w:rPr>
-        <w:t xml:space="preserve">The new Web Application must display interactive table data with a minimum of two tables. The table needs to </w:t>
-      </w:r>
-      <w:proofErr w:type="gramStart"/>
-      <w:r>
-        <w:rPr>
-          <w:color w:val="EE0000"/>
-          <w:lang w:val="en-AU"/>
-        </w:rPr>
-        <w:t>support:</w:t>
-      </w:r>
-      <w:proofErr w:type="gramEnd"/>
-      <w:r>
-        <w:rPr>
-          <w:color w:val="EE0000"/>
-          <w:lang w:val="en-AU"/>
-        </w:rPr>
-        <w:t xml:space="preserve"> sort, search and limit to 10 rows per page. User must be able to search by individual column.</w:t>
+        <w:t>The new Web Application must display interactive table data with a minimum of two tables. The table needs to support: sort, search and limit to 10 rows per page. User must be able to search by individual column.</w:t>
       </w:r>
     </w:p>
     <w:p>
@@ -1636,6 +1647,7 @@
           <w:bCs/>
           <w:lang w:val="en-AU"/>
         </w:rPr>
+        <w:lastRenderedPageBreak/>
         <w:t>B</w:t>
       </w:r>
       <w:r>
@@ -1803,7 +1815,7 @@
         </w:rPr>
         <w:t xml:space="preserve"> Displaying features on a Calendar such as event constraint can be done using </w:t>
       </w:r>
-      <w:hyperlink r:id="rId8" w:tgtFrame="_blank" w:history="1">
+      <w:hyperlink r:id="rId10" w:tgtFrame="_blank" w:history="1">
         <w:r>
           <w:rPr>
             <w:rStyle w:val="Hyperlink"/>
@@ -1873,23 +1885,7 @@
           <w:color w:val="EE0000"/>
           <w:lang w:val="en-AU"/>
         </w:rPr>
-        <w:t xml:space="preserve">Interactive Charts - The new Web Application must display an interactive chart or graph using data from </w:t>
-      </w:r>
-      <w:proofErr w:type="spellStart"/>
-      <w:r>
-        <w:rPr>
-          <w:color w:val="EE0000"/>
-          <w:lang w:val="en-AU"/>
-        </w:rPr>
-        <w:t>Firestore</w:t>
-      </w:r>
-      <w:proofErr w:type="spellEnd"/>
-      <w:r>
-        <w:rPr>
-          <w:color w:val="EE0000"/>
-          <w:lang w:val="en-AU"/>
-        </w:rPr>
-        <w:t xml:space="preserve">. </w:t>
+        <w:t xml:space="preserve">Interactive Charts - The new Web Application must display an interactive chart or graph using data from Firestore. </w:t>
       </w:r>
     </w:p>
     <w:p>
@@ -1925,23 +1921,7 @@
           <w:color w:val="EE0000"/>
           <w:lang w:val="en-AU"/>
         </w:rPr>
-        <w:t xml:space="preserve">Admin Dashboard - Create a dashboard view for the system admin of this environmental charity (you may want to create a </w:t>
-      </w:r>
-      <w:proofErr w:type="spellStart"/>
-      <w:r>
-        <w:rPr>
-          <w:color w:val="EE0000"/>
-          <w:lang w:val="en-AU"/>
-        </w:rPr>
-        <w:t>seprate</w:t>
-      </w:r>
-      <w:proofErr w:type="spellEnd"/>
-      <w:r>
-        <w:rPr>
-          <w:color w:val="EE0000"/>
-          <w:lang w:val="en-AU"/>
-        </w:rPr>
-        <w:t xml:space="preserve"> role for ‘admin’), where they can see an overview of the website including number of users and types of users.</w:t>
+        <w:t>Admin Dashboard - Create a dashboard view for the system admin of this environmental charity (you may want to create a seprate role for ‘admin’), where they can see an overview of the website including number of users and types of users.</w:t>
       </w:r>
     </w:p>
     <w:p>
@@ -1976,16 +1956,16 @@
       <w:pPr>
         <w:pStyle w:val="Heading2"/>
       </w:pPr>
-      <w:bookmarkStart w:id="5" w:name="_2isrbwqpfx3h" w:colFirst="0" w:colLast="0"/>
+      <w:bookmarkStart w:id="4" w:name="_2isrbwqpfx3h" w:colFirst="0" w:colLast="0"/>
+      <w:bookmarkEnd w:id="4"/>
+      <w:r>
+        <w:t>Section 4: Wireframes/Low-fidelity prototype</w:t>
+      </w:r>
+    </w:p>
+    <w:p/>
+    <w:p>
+      <w:bookmarkStart w:id="5" w:name="_t3r3kp80rvj6" w:colFirst="0" w:colLast="0"/>
       <w:bookmarkEnd w:id="5"/>
-      <w:r>
-        <w:t>Section 4: Wireframes/Low-fidelity prototype</w:t>
-      </w:r>
-    </w:p>
-    <w:p/>
-    <w:p>
-      <w:bookmarkStart w:id="6" w:name="_t3r3kp80rvj6" w:colFirst="0" w:colLast="0"/>
-      <w:bookmarkEnd w:id="6"/>
     </w:p>
     <w:p>
       <w:pPr>
@@ -1996,10 +1976,9 @@
           <w:szCs w:val="32"/>
         </w:rPr>
       </w:pPr>
-      <w:bookmarkStart w:id="7" w:name="_tfrl2vc49yie" w:colFirst="0" w:colLast="0"/>
-      <w:bookmarkEnd w:id="7"/>
-      <w:r>
-        <w:lastRenderedPageBreak/>
+      <w:bookmarkStart w:id="6" w:name="_tfrl2vc49yie" w:colFirst="0" w:colLast="0"/>
+      <w:bookmarkEnd w:id="6"/>
+      <w:r>
         <w:br w:type="page"/>
       </w:r>
     </w:p>
@@ -2044,7 +2023,7 @@
       <w:r>
         <w:t xml:space="preserve">However, you may use GenAI for brainstorming, problem solving and learning. You need to declare all such uses here. One row per help used. More details on how to acknowledge the use of Gen AI can be found </w:t>
       </w:r>
-      <w:hyperlink r:id="rId9">
+      <w:hyperlink r:id="rId11">
         <w:r>
           <w:rPr>
             <w:color w:val="0000FF"/>
@@ -2271,11 +2250,11 @@
     <w:p/>
     <w:p/>
     <w:sectPr>
-      <w:headerReference w:type="default" r:id="rId10"/>
       <w:pgSz w:w="11909" w:h="16834"/>
       <w:pgMar w:top="1440" w:right="1440" w:bottom="1440" w:left="1440" w:header="720" w:footer="720" w:gutter="0"/>
       <w:pgNumType w:start="1"/>
       <w:cols w:space="720"/>
+      <w:docGrid w:linePitch="299"/>
     </w:sectPr>
   </w:body>
 </w:document>
@@ -3137,6 +3116,7 @@
   <w:style w:type="character" w:default="1" w:styleId="DefaultParagraphFont">
     <w:name w:val="Default Paragraph Font"/>
     <w:uiPriority w:val="1"/>
+    <w:semiHidden/>
     <w:unhideWhenUsed/>
   </w:style>
   <w:style w:type="table" w:default="1" w:styleId="TableNormal">

</xml_diff>